<commit_message>
Complete teacher workflows and prepare independent email login
Isolate generation cache and credits, restore saved plan and worksheet access,
add authenticated Word/PDF downloads and safe PDF indexing runtime, implement
dormant transactional email OTP sessions, quarantine unreviewed payment providers,
and add disposable MySQL CI with staging rollout documentation.
</commit_message>
<xml_diff>
--- a/server/templates/plan_template_qa.docx
+++ b/server/templates/plan_template_qa.docx
@@ -6,22 +6,32 @@
       <w:pPr>
         <w:pStyle w:val="Title"/>
         <w:jc w:val="center"/>
+        <w:bidi w:val="1"/>
       </w:pPr>
       <w:r>
         <w:rPr>
+          <w:rFonts w:cs="Arial"/>
           <w:color w:val="0D6B56"/>
           <w:sz w:val="36"/>
         </w:rPr>
         <w:t>خطة درس يومية</w:t>
       </w:r>
     </w:p>
-    <w:p/>
+    <w:p>
+      <w:pPr>
+        <w:bidi w:val="1"/>
+        <w:jc w:val="right"/>
+      </w:pPr>
+    </w:p>
     <w:p>
       <w:pPr>
         <w:pStyle w:val="Heading1"/>
+        <w:bidi w:val="1"/>
+        <w:jc w:val="right"/>
       </w:pPr>
       <w:r>
         <w:rPr>
+          <w:rFonts w:cs="Arial"/>
           <w:color w:val="0D6B56"/>
         </w:rPr>
         <w:t>المعلومات الأساسية</w:t>
@@ -33,6 +43,7 @@
         <w:tblW w:type="auto" w:w="0"/>
         <w:jc w:val="center"/>
         <w:tblLook w:firstColumn="1" w:firstRow="1" w:lastColumn="0" w:lastRow="0" w:noHBand="0" w:noVBand="1" w:val="04A0"/>
+        <w:bidiVisual/>
       </w:tblPr>
       <w:tblGrid>
         <w:gridCol w:w="2351"/>
@@ -46,9 +57,18 @@
             <w:tcW w:type="dxa" w:w="2351"/>
           </w:tcPr>
           <w:p>
-            <w:r/>
+            <w:pPr>
+              <w:bidi w:val="1"/>
+              <w:jc w:val="right"/>
+            </w:pPr>
             <w:r>
               <w:rPr>
+                <w:rFonts w:cs="Arial"/>
+              </w:rPr>
+            </w:r>
+            <w:r>
+              <w:rPr>
+                <w:rFonts w:cs="Arial"/>
                 <w:b/>
                 <w:color w:val="333333"/>
                 <w:sz w:val="22"/>
@@ -62,9 +82,18 @@
             <w:tcW w:type="dxa" w:w="2351"/>
           </w:tcPr>
           <w:p>
-            <w:r/>
+            <w:pPr>
+              <w:bidi w:val="1"/>
+              <w:jc w:val="right"/>
+            </w:pPr>
             <w:r>
               <w:rPr>
+                <w:rFonts w:cs="Arial"/>
+              </w:rPr>
+            </w:r>
+            <w:r>
+              <w:rPr>
+                <w:rFonts w:cs="Arial"/>
                 <w:sz w:val="22"/>
               </w:rPr>
               <w:t>{basic_info.subject}</w:t>
@@ -76,9 +105,18 @@
             <w:tcW w:type="dxa" w:w="2351"/>
           </w:tcPr>
           <w:p>
-            <w:r/>
+            <w:pPr>
+              <w:bidi w:val="1"/>
+              <w:jc w:val="right"/>
+            </w:pPr>
             <w:r>
               <w:rPr>
+                <w:rFonts w:cs="Arial"/>
+              </w:rPr>
+            </w:r>
+            <w:r>
+              <w:rPr>
+                <w:rFonts w:cs="Arial"/>
                 <w:b/>
                 <w:color w:val="333333"/>
                 <w:sz w:val="22"/>
@@ -92,9 +130,18 @@
             <w:tcW w:type="dxa" w:w="2351"/>
           </w:tcPr>
           <w:p>
-            <w:r/>
+            <w:pPr>
+              <w:bidi w:val="1"/>
+              <w:jc w:val="right"/>
+            </w:pPr>
             <w:r>
               <w:rPr>
+                <w:rFonts w:cs="Arial"/>
+              </w:rPr>
+            </w:r>
+            <w:r>
+              <w:rPr>
+                <w:rFonts w:cs="Arial"/>
                 <w:sz w:val="22"/>
               </w:rPr>
               <w:t>{basic_info.grade}</w:t>
@@ -108,9 +155,18 @@
             <w:tcW w:type="dxa" w:w="2351"/>
           </w:tcPr>
           <w:p>
-            <w:r/>
+            <w:pPr>
+              <w:bidi w:val="1"/>
+              <w:jc w:val="right"/>
+            </w:pPr>
             <w:r>
               <w:rPr>
+                <w:rFonts w:cs="Arial"/>
+              </w:rPr>
+            </w:r>
+            <w:r>
+              <w:rPr>
+                <w:rFonts w:cs="Arial"/>
                 <w:b/>
                 <w:color w:val="333333"/>
                 <w:sz w:val="22"/>
@@ -124,9 +180,18 @@
             <w:tcW w:type="dxa" w:w="2351"/>
           </w:tcPr>
           <w:p>
-            <w:r/>
+            <w:pPr>
+              <w:bidi w:val="1"/>
+              <w:jc w:val="right"/>
+            </w:pPr>
             <w:r>
               <w:rPr>
+                <w:rFonts w:cs="Arial"/>
+              </w:rPr>
+            </w:r>
+            <w:r>
+              <w:rPr>
+                <w:rFonts w:cs="Arial"/>
                 <w:sz w:val="22"/>
               </w:rPr>
               <w:t>{basic_info.unit}</w:t>
@@ -138,9 +203,18 @@
             <w:tcW w:type="dxa" w:w="2351"/>
           </w:tcPr>
           <w:p>
-            <w:r/>
+            <w:pPr>
+              <w:bidi w:val="1"/>
+              <w:jc w:val="right"/>
+            </w:pPr>
             <w:r>
               <w:rPr>
+                <w:rFonts w:cs="Arial"/>
+              </w:rPr>
+            </w:r>
+            <w:r>
+              <w:rPr>
+                <w:rFonts w:cs="Arial"/>
                 <w:b/>
                 <w:color w:val="333333"/>
                 <w:sz w:val="22"/>
@@ -154,9 +228,18 @@
             <w:tcW w:type="dxa" w:w="2351"/>
           </w:tcPr>
           <w:p>
-            <w:r/>
+            <w:pPr>
+              <w:bidi w:val="1"/>
+              <w:jc w:val="right"/>
+            </w:pPr>
             <w:r>
               <w:rPr>
+                <w:rFonts w:cs="Arial"/>
+              </w:rPr>
+            </w:r>
+            <w:r>
+              <w:rPr>
+                <w:rFonts w:cs="Arial"/>
                 <w:sz w:val="22"/>
               </w:rPr>
               <w:t>{basic_info.lesson}</w:t>
@@ -170,9 +253,18 @@
             <w:tcW w:type="dxa" w:w="2351"/>
           </w:tcPr>
           <w:p>
-            <w:r/>
+            <w:pPr>
+              <w:bidi w:val="1"/>
+              <w:jc w:val="right"/>
+            </w:pPr>
             <w:r>
               <w:rPr>
+                <w:rFonts w:cs="Arial"/>
+              </w:rPr>
+            </w:r>
+            <w:r>
+              <w:rPr>
+                <w:rFonts w:cs="Arial"/>
                 <w:b/>
                 <w:color w:val="333333"/>
                 <w:sz w:val="22"/>
@@ -186,9 +278,18 @@
             <w:tcW w:type="dxa" w:w="2351"/>
           </w:tcPr>
           <w:p>
-            <w:r/>
+            <w:pPr>
+              <w:bidi w:val="1"/>
+              <w:jc w:val="right"/>
+            </w:pPr>
             <w:r>
               <w:rPr>
+                <w:rFonts w:cs="Arial"/>
+              </w:rPr>
+            </w:r>
+            <w:r>
+              <w:rPr>
+                <w:rFonts w:cs="Arial"/>
                 <w:sz w:val="22"/>
               </w:rPr>
               <w:t>{basic_info.date}</w:t>
@@ -200,9 +301,18 @@
             <w:tcW w:type="dxa" w:w="2351"/>
           </w:tcPr>
           <w:p>
-            <w:r/>
+            <w:pPr>
+              <w:bidi w:val="1"/>
+              <w:jc w:val="right"/>
+            </w:pPr>
             <w:r>
               <w:rPr>
+                <w:rFonts w:cs="Arial"/>
+              </w:rPr>
+            </w:r>
+            <w:r>
+              <w:rPr>
+                <w:rFonts w:cs="Arial"/>
                 <w:b/>
                 <w:color w:val="333333"/>
                 <w:sz w:val="22"/>
@@ -216,9 +326,18 @@
             <w:tcW w:type="dxa" w:w="2351"/>
           </w:tcPr>
           <w:p>
-            <w:r/>
+            <w:pPr>
+              <w:bidi w:val="1"/>
+              <w:jc w:val="right"/>
+            </w:pPr>
             <w:r>
               <w:rPr>
+                <w:rFonts w:cs="Arial"/>
+              </w:rPr>
+            </w:r>
+            <w:r>
+              <w:rPr>
+                <w:rFonts w:cs="Arial"/>
                 <w:sz w:val="22"/>
               </w:rPr>
               <w:t>{basic_info.periods}</w:t>
@@ -232,9 +351,18 @@
             <w:tcW w:type="dxa" w:w="2351"/>
           </w:tcPr>
           <w:p>
-            <w:r/>
+            <w:pPr>
+              <w:bidi w:val="1"/>
+              <w:jc w:val="right"/>
+            </w:pPr>
             <w:r>
               <w:rPr>
+                <w:rFonts w:cs="Arial"/>
+              </w:rPr>
+            </w:r>
+            <w:r>
+              <w:rPr>
+                <w:rFonts w:cs="Arial"/>
                 <w:b/>
                 <w:color w:val="333333"/>
                 <w:sz w:val="22"/>
@@ -248,9 +376,18 @@
             <w:tcW w:type="dxa" w:w="2351"/>
           </w:tcPr>
           <w:p>
-            <w:r/>
+            <w:pPr>
+              <w:bidi w:val="1"/>
+              <w:jc w:val="right"/>
+            </w:pPr>
             <w:r>
               <w:rPr>
+                <w:rFonts w:cs="Arial"/>
+              </w:rPr>
+            </w:r>
+            <w:r>
+              <w:rPr>
+                <w:rFonts w:cs="Arial"/>
                 <w:sz w:val="22"/>
               </w:rPr>
               <w:t>{basic_info.pages}</w:t>
@@ -262,9 +399,18 @@
             <w:tcW w:type="dxa" w:w="2351"/>
           </w:tcPr>
           <w:p>
-            <w:r/>
+            <w:pPr>
+              <w:bidi w:val="1"/>
+              <w:jc w:val="right"/>
+            </w:pPr>
             <w:r>
               <w:rPr>
+                <w:rFonts w:cs="Arial"/>
+              </w:rPr>
+            </w:r>
+            <w:r>
+              <w:rPr>
+                <w:rFonts w:cs="Arial"/>
                 <w:b/>
                 <w:color w:val="333333"/>
                 <w:sz w:val="22"/>
@@ -277,9 +423,18 @@
             <w:tcW w:type="dxa" w:w="2351"/>
           </w:tcPr>
           <w:p>
-            <w:r/>
+            <w:pPr>
+              <w:bidi w:val="1"/>
+              <w:jc w:val="right"/>
+            </w:pPr>
             <w:r>
               <w:rPr>
+                <w:rFonts w:cs="Arial"/>
+              </w:rPr>
+            </w:r>
+            <w:r>
+              <w:rPr>
+                <w:rFonts w:cs="Arial"/>
                 <w:sz w:val="22"/>
               </w:rPr>
             </w:r>
@@ -287,13 +442,21 @@
         </w:tc>
       </w:tr>
     </w:tbl>
-    <w:p/>
+    <w:p>
+      <w:pPr>
+        <w:bidi w:val="1"/>
+        <w:jc w:val="right"/>
+      </w:pPr>
+    </w:p>
     <w:p>
       <w:pPr>
         <w:pStyle w:val="Heading1"/>
+        <w:bidi w:val="1"/>
+        <w:jc w:val="right"/>
       </w:pPr>
       <w:r>
         <w:rPr>
+          <w:rFonts w:cs="Arial"/>
           <w:color w:val="0D6B56"/>
         </w:rPr>
         <w:t>الأهداف التعليمية</w:t>
@@ -302,75 +465,200 @@
     <w:p>
       <w:pPr>
         <w:pStyle w:val="ListBullet"/>
+        <w:bidi w:val="1"/>
+        <w:jc w:val="right"/>
       </w:pPr>
       <w:r>
+        <w:rPr>
+          <w:rFonts w:cs="Arial"/>
+        </w:rPr>
         <w:t>الأهداف المعرفية:</w:t>
       </w:r>
     </w:p>
     <w:p>
       <w:pPr>
-        <w:pStyle w:val="ListBullet2"/>
+        <w:bidi w:val="1"/>
+        <w:jc w:val="right"/>
       </w:pPr>
       <w:r>
+        <w:rPr>
+          <w:rFonts w:cs="Arial"/>
+        </w:rPr>
         <w:t>{#objectives.cognitive}</w:t>
       </w:r>
     </w:p>
     <w:p>
       <w:pPr>
-        <w:pStyle w:val="ListBullet"/>
+        <w:pStyle w:val="ListBullet2"/>
+        <w:bidi w:val="1"/>
+        <w:jc w:val="right"/>
       </w:pPr>
       <w:r>
+        <w:rPr>
+          <w:rFonts w:cs="Arial"/>
+        </w:rPr>
+        <w:t>{text}</w:t>
+      </w:r>
+    </w:p>
+    <w:p>
+      <w:pPr>
+        <w:bidi w:val="1"/>
+        <w:jc w:val="right"/>
+      </w:pPr>
+      <w:r>
+        <w:rPr>
+          <w:rFonts w:cs="Arial"/>
+        </w:rPr>
+        <w:t>{/objectives.cognitive}</w:t>
+      </w:r>
+    </w:p>
+    <w:p>
+      <w:pPr>
+        <w:pStyle w:val="ListBullet"/>
+        <w:bidi w:val="1"/>
+        <w:jc w:val="right"/>
+      </w:pPr>
+      <w:r>
+        <w:rPr>
+          <w:rFonts w:cs="Arial"/>
+        </w:rPr>
         <w:t>الأهداف المهارية:</w:t>
       </w:r>
     </w:p>
     <w:p>
       <w:pPr>
-        <w:pStyle w:val="ListBullet2"/>
+        <w:bidi w:val="1"/>
+        <w:jc w:val="right"/>
       </w:pPr>
       <w:r>
+        <w:rPr>
+          <w:rFonts w:cs="Arial"/>
+        </w:rPr>
         <w:t>{#objectives.skills}</w:t>
       </w:r>
     </w:p>
     <w:p>
       <w:pPr>
-        <w:pStyle w:val="ListBullet"/>
+        <w:pStyle w:val="ListBullet2"/>
+        <w:bidi w:val="1"/>
+        <w:jc w:val="right"/>
       </w:pPr>
       <w:r>
+        <w:rPr>
+          <w:rFonts w:cs="Arial"/>
+        </w:rPr>
+        <w:t>{text}</w:t>
+      </w:r>
+    </w:p>
+    <w:p>
+      <w:pPr>
+        <w:bidi w:val="1"/>
+        <w:jc w:val="right"/>
+      </w:pPr>
+      <w:r>
+        <w:rPr>
+          <w:rFonts w:cs="Arial"/>
+        </w:rPr>
+        <w:t>{/objectives.skills}</w:t>
+      </w:r>
+    </w:p>
+    <w:p>
+      <w:pPr>
+        <w:pStyle w:val="ListBullet"/>
+        <w:bidi w:val="1"/>
+        <w:jc w:val="right"/>
+      </w:pPr>
+      <w:r>
+        <w:rPr>
+          <w:rFonts w:cs="Arial"/>
+        </w:rPr>
         <w:t>الأهداف الوجدانية:</w:t>
       </w:r>
     </w:p>
     <w:p>
       <w:pPr>
-        <w:pStyle w:val="ListBullet2"/>
+        <w:bidi w:val="1"/>
+        <w:jc w:val="right"/>
       </w:pPr>
       <w:r>
+        <w:rPr>
+          <w:rFonts w:cs="Arial"/>
+        </w:rPr>
         <w:t>{#objectives.affective}</w:t>
       </w:r>
     </w:p>
-    <w:p/>
+    <w:p>
+      <w:pPr>
+        <w:pStyle w:val="ListBullet2"/>
+        <w:bidi w:val="1"/>
+        <w:jc w:val="right"/>
+      </w:pPr>
+      <w:r>
+        <w:rPr>
+          <w:rFonts w:cs="Arial"/>
+        </w:rPr>
+        <w:t>{text}</w:t>
+      </w:r>
+    </w:p>
+    <w:p>
+      <w:pPr>
+        <w:bidi w:val="1"/>
+        <w:jc w:val="right"/>
+      </w:pPr>
+      <w:r>
+        <w:rPr>
+          <w:rFonts w:cs="Arial"/>
+        </w:rPr>
+        <w:t>{/objectives.affective}</w:t>
+      </w:r>
+    </w:p>
+    <w:p>
+      <w:pPr>
+        <w:bidi w:val="1"/>
+        <w:jc w:val="right"/>
+      </w:pPr>
+    </w:p>
     <w:p>
       <w:pPr>
         <w:pStyle w:val="Heading1"/>
+        <w:bidi w:val="1"/>
+        <w:jc w:val="right"/>
       </w:pPr>
       <w:r>
         <w:rPr>
+          <w:rFonts w:cs="Arial"/>
           <w:color w:val="0D6B56"/>
         </w:rPr>
         <w:t>التهيئة</w:t>
       </w:r>
     </w:p>
     <w:p>
+      <w:pPr>
+        <w:bidi w:val="1"/>
+        <w:jc w:val="right"/>
+      </w:pPr>
       <w:r>
+        <w:rPr>
+          <w:rFonts w:cs="Arial"/>
+        </w:rPr>
         <w:t>{warm_up}</w:t>
       </w:r>
     </w:p>
-    <w:p/>
+    <w:p>
+      <w:pPr>
+        <w:bidi w:val="1"/>
+        <w:jc w:val="right"/>
+      </w:pPr>
+    </w:p>
     <w:p>
       <w:pPr>
         <w:pStyle w:val="Heading1"/>
+        <w:bidi w:val="1"/>
+        <w:jc w:val="right"/>
       </w:pPr>
       <w:r>
         <w:rPr>
+          <w:rFonts w:cs="Arial"/>
           <w:color w:val="0D6B56"/>
         </w:rPr>
         <w:t>استراتيجيات التدريس والوسائل</w:t>
@@ -379,42 +667,118 @@
     <w:p>
       <w:pPr>
         <w:pStyle w:val="ListBullet"/>
+        <w:bidi w:val="1"/>
+        <w:jc w:val="right"/>
       </w:pPr>
       <w:r>
+        <w:rPr>
+          <w:rFonts w:cs="Arial"/>
+        </w:rPr>
         <w:t>الاستراتيجيات:</w:t>
       </w:r>
     </w:p>
     <w:p>
       <w:pPr>
-        <w:pStyle w:val="ListBullet2"/>
+        <w:bidi w:val="1"/>
+        <w:jc w:val="right"/>
       </w:pPr>
       <w:r>
+        <w:rPr>
+          <w:rFonts w:cs="Arial"/>
+        </w:rPr>
         <w:t>{#strategies}</w:t>
       </w:r>
     </w:p>
     <w:p>
       <w:pPr>
-        <w:pStyle w:val="ListBullet"/>
+        <w:pStyle w:val="ListBullet2"/>
+        <w:bidi w:val="1"/>
+        <w:jc w:val="right"/>
       </w:pPr>
       <w:r>
+        <w:rPr>
+          <w:rFonts w:cs="Arial"/>
+        </w:rPr>
+        <w:t>{text}</w:t>
+      </w:r>
+    </w:p>
+    <w:p>
+      <w:pPr>
+        <w:bidi w:val="1"/>
+        <w:jc w:val="right"/>
+      </w:pPr>
+      <w:r>
+        <w:rPr>
+          <w:rFonts w:cs="Arial"/>
+        </w:rPr>
+        <w:t>{/strategies}</w:t>
+      </w:r>
+    </w:p>
+    <w:p>
+      <w:pPr>
+        <w:pStyle w:val="ListBullet"/>
+        <w:bidi w:val="1"/>
+        <w:jc w:val="right"/>
+      </w:pPr>
+      <w:r>
+        <w:rPr>
+          <w:rFonts w:cs="Arial"/>
+        </w:rPr>
         <w:t>الوسائل التعليمية:</w:t>
       </w:r>
     </w:p>
     <w:p>
       <w:pPr>
-        <w:pStyle w:val="ListBullet2"/>
+        <w:bidi w:val="1"/>
+        <w:jc w:val="right"/>
       </w:pPr>
       <w:r>
+        <w:rPr>
+          <w:rFonts w:cs="Arial"/>
+        </w:rPr>
         <w:t>{#materials}</w:t>
       </w:r>
     </w:p>
-    <w:p/>
+    <w:p>
+      <w:pPr>
+        <w:pStyle w:val="ListBullet2"/>
+        <w:bidi w:val="1"/>
+        <w:jc w:val="right"/>
+      </w:pPr>
+      <w:r>
+        <w:rPr>
+          <w:rFonts w:cs="Arial"/>
+        </w:rPr>
+        <w:t>{text}</w:t>
+      </w:r>
+    </w:p>
+    <w:p>
+      <w:pPr>
+        <w:bidi w:val="1"/>
+        <w:jc w:val="right"/>
+      </w:pPr>
+      <w:r>
+        <w:rPr>
+          <w:rFonts w:cs="Arial"/>
+        </w:rPr>
+        <w:t>{/materials}</w:t>
+      </w:r>
+    </w:p>
+    <w:p>
+      <w:pPr>
+        <w:bidi w:val="1"/>
+        <w:jc w:val="right"/>
+      </w:pPr>
+    </w:p>
     <w:p>
       <w:pPr>
         <w:pStyle w:val="Heading1"/>
+        <w:bidi w:val="1"/>
+        <w:jc w:val="right"/>
       </w:pPr>
       <w:r>
         <w:rPr>
+          <w:rFonts w:cs="Arial"/>
           <w:color w:val="0D6B56"/>
         </w:rPr>
         <w:t>خطوات تنفيذ الدرس</w:t>
@@ -426,6 +790,7 @@
         <w:tblW w:type="auto" w:w="0"/>
         <w:jc w:val="center"/>
         <w:tblLook w:firstColumn="1" w:firstRow="1" w:lastColumn="0" w:lastRow="0" w:noHBand="0" w:noVBand="1" w:val="04A0"/>
+        <w:bidiVisual/>
       </w:tblPr>
       <w:tblGrid>
         <w:gridCol w:w="2351"/>
@@ -439,9 +804,18 @@
             <w:tcW w:type="dxa" w:w="2351"/>
           </w:tcPr>
           <w:p>
-            <w:r/>
+            <w:pPr>
+              <w:bidi w:val="1"/>
+              <w:jc w:val="right"/>
+            </w:pPr>
             <w:r>
               <w:rPr>
+                <w:rFonts w:cs="Arial"/>
+              </w:rPr>
+            </w:r>
+            <w:r>
+              <w:rPr>
+                <w:rFonts w:cs="Arial"/>
                 <w:b/>
                 <w:color w:val="0D6B56"/>
                 <w:sz w:val="22"/>
@@ -455,9 +829,18 @@
             <w:tcW w:type="dxa" w:w="2351"/>
           </w:tcPr>
           <w:p>
-            <w:r/>
+            <w:pPr>
+              <w:bidi w:val="1"/>
+              <w:jc w:val="right"/>
+            </w:pPr>
             <w:r>
               <w:rPr>
+                <w:rFonts w:cs="Arial"/>
+              </w:rPr>
+            </w:r>
+            <w:r>
+              <w:rPr>
+                <w:rFonts w:cs="Arial"/>
                 <w:b/>
                 <w:color w:val="0D6B56"/>
                 <w:sz w:val="22"/>
@@ -471,9 +854,18 @@
             <w:tcW w:type="dxa" w:w="2351"/>
           </w:tcPr>
           <w:p>
-            <w:r/>
+            <w:pPr>
+              <w:bidi w:val="1"/>
+              <w:jc w:val="right"/>
+            </w:pPr>
             <w:r>
               <w:rPr>
+                <w:rFonts w:cs="Arial"/>
+              </w:rPr>
+            </w:r>
+            <w:r>
+              <w:rPr>
+                <w:rFonts w:cs="Arial"/>
                 <w:b/>
                 <w:color w:val="0D6B56"/>
                 <w:sz w:val="22"/>
@@ -487,9 +879,18 @@
             <w:tcW w:type="dxa" w:w="2351"/>
           </w:tcPr>
           <w:p>
-            <w:r/>
+            <w:pPr>
+              <w:bidi w:val="1"/>
+              <w:jc w:val="right"/>
+            </w:pPr>
             <w:r>
               <w:rPr>
+                <w:rFonts w:cs="Arial"/>
+              </w:rPr>
+            </w:r>
+            <w:r>
+              <w:rPr>
+                <w:rFonts w:cs="Arial"/>
                 <w:b/>
                 <w:color w:val="0D6B56"/>
                 <w:sz w:val="22"/>
@@ -505,7 +906,14 @@
             <w:tcW w:type="dxa" w:w="2351"/>
           </w:tcPr>
           <w:p>
+            <w:pPr>
+              <w:bidi w:val="1"/>
+              <w:jc w:val="right"/>
+            </w:pPr>
             <w:r>
+              <w:rPr>
+                <w:rFonts w:cs="Arial"/>
+              </w:rPr>
               <w:t>{#procedures}{step}</w:t>
             </w:r>
           </w:p>
@@ -515,7 +923,14 @@
             <w:tcW w:type="dxa" w:w="2351"/>
           </w:tcPr>
           <w:p>
+            <w:pPr>
+              <w:bidi w:val="1"/>
+              <w:jc w:val="right"/>
+            </w:pPr>
             <w:r>
+              <w:rPr>
+                <w:rFonts w:cs="Arial"/>
+              </w:rPr>
               <w:t>{time_minutes}</w:t>
             </w:r>
           </w:p>
@@ -525,7 +940,14 @@
             <w:tcW w:type="dxa" w:w="2351"/>
           </w:tcPr>
           <w:p>
+            <w:pPr>
+              <w:bidi w:val="1"/>
+              <w:jc w:val="right"/>
+            </w:pPr>
             <w:r>
+              <w:rPr>
+                <w:rFonts w:cs="Arial"/>
+              </w:rPr>
               <w:t>{teacher_role}</w:t>
             </w:r>
           </w:p>
@@ -535,20 +957,35 @@
             <w:tcW w:type="dxa" w:w="2351"/>
           </w:tcPr>
           <w:p>
+            <w:pPr>
+              <w:bidi w:val="1"/>
+              <w:jc w:val="right"/>
+            </w:pPr>
             <w:r>
+              <w:rPr>
+                <w:rFonts w:cs="Arial"/>
+              </w:rPr>
               <w:t>{student_role}{/procedures}</w:t>
             </w:r>
           </w:p>
         </w:tc>
       </w:tr>
     </w:tbl>
-    <w:p/>
+    <w:p>
+      <w:pPr>
+        <w:bidi w:val="1"/>
+        <w:jc w:val="right"/>
+      </w:pPr>
+    </w:p>
     <w:p>
       <w:pPr>
         <w:pStyle w:val="Heading1"/>
+        <w:bidi w:val="1"/>
+        <w:jc w:val="right"/>
       </w:pPr>
       <w:r>
         <w:rPr>
+          <w:rFonts w:cs="Arial"/>
           <w:color w:val="0D6B56"/>
         </w:rPr>
         <w:t>التقويم</w:t>
@@ -557,55 +994,143 @@
     <w:p>
       <w:pPr>
         <w:pStyle w:val="ListBullet"/>
+        <w:bidi w:val="1"/>
+        <w:jc w:val="right"/>
       </w:pPr>
       <w:r>
+        <w:rPr>
+          <w:rFonts w:cs="Arial"/>
+        </w:rPr>
         <w:t>التقويم القبلي:</w:t>
       </w:r>
     </w:p>
     <w:p>
+      <w:pPr>
+        <w:bidi w:val="1"/>
+        <w:jc w:val="right"/>
+      </w:pPr>
       <w:r>
+        <w:rPr>
+          <w:rFonts w:cs="Arial"/>
+        </w:rPr>
         <w:t>{assessment.diagnostic}</w:t>
       </w:r>
     </w:p>
     <w:p>
       <w:pPr>
         <w:pStyle w:val="ListBullet"/>
+        <w:bidi w:val="1"/>
+        <w:jc w:val="right"/>
       </w:pPr>
       <w:r>
+        <w:rPr>
+          <w:rFonts w:cs="Arial"/>
+        </w:rPr>
         <w:t>التقويم البنائي:</w:t>
       </w:r>
     </w:p>
     <w:p>
       <w:pPr>
-        <w:pStyle w:val="ListBullet2"/>
+        <w:bidi w:val="1"/>
+        <w:jc w:val="right"/>
       </w:pPr>
       <w:r>
+        <w:rPr>
+          <w:rFonts w:cs="Arial"/>
+        </w:rPr>
         <w:t>{#assessment.formative}</w:t>
       </w:r>
     </w:p>
     <w:p>
       <w:pPr>
-        <w:pStyle w:val="ListBullet"/>
+        <w:pStyle w:val="ListBullet2"/>
+        <w:bidi w:val="1"/>
+        <w:jc w:val="right"/>
       </w:pPr>
       <w:r>
+        <w:rPr>
+          <w:rFonts w:cs="Arial"/>
+        </w:rPr>
+        <w:t>{text}</w:t>
+      </w:r>
+    </w:p>
+    <w:p>
+      <w:pPr>
+        <w:bidi w:val="1"/>
+        <w:jc w:val="right"/>
+      </w:pPr>
+      <w:r>
+        <w:rPr>
+          <w:rFonts w:cs="Arial"/>
+        </w:rPr>
+        <w:t>{/assessment.formative}</w:t>
+      </w:r>
+    </w:p>
+    <w:p>
+      <w:pPr>
+        <w:pStyle w:val="ListBullet"/>
+        <w:bidi w:val="1"/>
+        <w:jc w:val="right"/>
+      </w:pPr>
+      <w:r>
+        <w:rPr>
+          <w:rFonts w:cs="Arial"/>
+        </w:rPr>
         <w:t>التقويم الختامي:</w:t>
       </w:r>
     </w:p>
     <w:p>
       <w:pPr>
-        <w:pStyle w:val="ListBullet2"/>
+        <w:bidi w:val="1"/>
+        <w:jc w:val="right"/>
       </w:pPr>
       <w:r>
+        <w:rPr>
+          <w:rFonts w:cs="Arial"/>
+        </w:rPr>
         <w:t>{#assessment.summative}</w:t>
       </w:r>
     </w:p>
-    <w:p/>
+    <w:p>
+      <w:pPr>
+        <w:pStyle w:val="ListBullet2"/>
+        <w:bidi w:val="1"/>
+        <w:jc w:val="right"/>
+      </w:pPr>
+      <w:r>
+        <w:rPr>
+          <w:rFonts w:cs="Arial"/>
+        </w:rPr>
+        <w:t>{text}</w:t>
+      </w:r>
+    </w:p>
+    <w:p>
+      <w:pPr>
+        <w:bidi w:val="1"/>
+        <w:jc w:val="right"/>
+      </w:pPr>
+      <w:r>
+        <w:rPr>
+          <w:rFonts w:cs="Arial"/>
+        </w:rPr>
+        <w:t>{/assessment.summative}</w:t>
+      </w:r>
+    </w:p>
+    <w:p>
+      <w:pPr>
+        <w:bidi w:val="1"/>
+        <w:jc w:val="right"/>
+      </w:pPr>
+    </w:p>
     <w:p>
       <w:pPr>
         <w:pStyle w:val="Heading1"/>
+        <w:bidi w:val="1"/>
+        <w:jc w:val="right"/>
       </w:pPr>
       <w:r>
         <w:rPr>
+          <w:rFonts w:cs="Arial"/>
           <w:color w:val="0D6B56"/>
         </w:rPr>
         <w:t>القيم التربوية</w:t>
@@ -613,36 +1138,88 @@
     </w:p>
     <w:p>
       <w:pPr>
-        <w:pStyle w:val="ListBullet"/>
+        <w:bidi w:val="1"/>
+        <w:jc w:val="right"/>
       </w:pPr>
       <w:r>
+        <w:rPr>
+          <w:rFonts w:cs="Arial"/>
+        </w:rPr>
         <w:t>{#values}</w:t>
       </w:r>
     </w:p>
-    <w:p/>
+    <w:p>
+      <w:pPr>
+        <w:pStyle w:val="ListBullet"/>
+        <w:bidi w:val="1"/>
+        <w:jc w:val="right"/>
+      </w:pPr>
+      <w:r>
+        <w:rPr>
+          <w:rFonts w:cs="Arial"/>
+        </w:rPr>
+        <w:t>{text}</w:t>
+      </w:r>
+    </w:p>
+    <w:p>
+      <w:pPr>
+        <w:bidi w:val="1"/>
+        <w:jc w:val="right"/>
+      </w:pPr>
+      <w:r>
+        <w:rPr>
+          <w:rFonts w:cs="Arial"/>
+        </w:rPr>
+        <w:t>{/values}</w:t>
+      </w:r>
+    </w:p>
+    <w:p>
+      <w:pPr>
+        <w:bidi w:val="1"/>
+        <w:jc w:val="right"/>
+      </w:pPr>
+    </w:p>
     <w:p>
       <w:pPr>
         <w:pStyle w:val="Heading1"/>
+        <w:bidi w:val="1"/>
+        <w:jc w:val="right"/>
       </w:pPr>
       <w:r>
         <w:rPr>
+          <w:rFonts w:cs="Arial"/>
           <w:color w:val="0D6B56"/>
         </w:rPr>
         <w:t>الدمج التكنولوجي</w:t>
       </w:r>
     </w:p>
     <w:p>
+      <w:pPr>
+        <w:bidi w:val="1"/>
+        <w:jc w:val="right"/>
+      </w:pPr>
       <w:r>
+        <w:rPr>
+          <w:rFonts w:cs="Arial"/>
+        </w:rPr>
         <w:t>{tech_integration}</w:t>
       </w:r>
     </w:p>
-    <w:p/>
+    <w:p>
+      <w:pPr>
+        <w:bidi w:val="1"/>
+        <w:jc w:val="right"/>
+      </w:pPr>
+    </w:p>
     <w:p>
       <w:pPr>
         <w:pStyle w:val="Heading1"/>
+        <w:bidi w:val="1"/>
+        <w:jc w:val="right"/>
       </w:pPr>
       <w:r>
         <w:rPr>
+          <w:rFonts w:cs="Arial"/>
           <w:color w:val="0D6B56"/>
         </w:rPr>
         <w:t>مراعاة الفروق الفردية</w:t>
@@ -654,6 +1231,7 @@
         <w:tblW w:type="auto" w:w="0"/>
         <w:jc w:val="center"/>
         <w:tblLook w:firstColumn="1" w:firstRow="1" w:lastColumn="0" w:lastRow="0" w:noHBand="0" w:noVBand="1" w:val="04A0"/>
+        <w:bidiVisual/>
       </w:tblPr>
       <w:tblGrid>
         <w:gridCol w:w="4703"/>
@@ -665,9 +1243,18 @@
             <w:tcW w:type="dxa" w:w="4703"/>
           </w:tcPr>
           <w:p>
-            <w:r/>
+            <w:pPr>
+              <w:bidi w:val="1"/>
+              <w:jc w:val="right"/>
+            </w:pPr>
             <w:r>
               <w:rPr>
+                <w:rFonts w:cs="Arial"/>
+              </w:rPr>
+            </w:r>
+            <w:r>
+              <w:rPr>
+                <w:rFonts w:cs="Arial"/>
                 <w:b/>
                 <w:color w:val="0D6B56"/>
                 <w:sz w:val="22"/>
@@ -681,9 +1268,18 @@
             <w:tcW w:type="dxa" w:w="4703"/>
           </w:tcPr>
           <w:p>
-            <w:r/>
+            <w:pPr>
+              <w:bidi w:val="1"/>
+              <w:jc w:val="right"/>
+            </w:pPr>
             <w:r>
               <w:rPr>
+                <w:rFonts w:cs="Arial"/>
+              </w:rPr>
+            </w:r>
+            <w:r>
+              <w:rPr>
+                <w:rFonts w:cs="Arial"/>
                 <w:b/>
                 <w:color w:val="0D6B56"/>
                 <w:sz w:val="22"/>
@@ -699,7 +1295,14 @@
             <w:tcW w:type="dxa" w:w="4703"/>
           </w:tcPr>
           <w:p>
+            <w:pPr>
+              <w:bidi w:val="1"/>
+              <w:jc w:val="right"/>
+            </w:pPr>
             <w:r>
+              <w:rPr>
+                <w:rFonts w:cs="Arial"/>
+              </w:rPr>
               <w:t>{differentiation.support}</w:t>
             </w:r>
           </w:p>
@@ -709,54 +1312,102 @@
             <w:tcW w:type="dxa" w:w="4703"/>
           </w:tcPr>
           <w:p>
+            <w:pPr>
+              <w:bidi w:val="1"/>
+              <w:jc w:val="right"/>
+            </w:pPr>
             <w:r>
+              <w:rPr>
+                <w:rFonts w:cs="Arial"/>
+              </w:rPr>
               <w:t>{differentiation.enrichment}</w:t>
             </w:r>
           </w:p>
         </w:tc>
       </w:tr>
     </w:tbl>
-    <w:p/>
+    <w:p>
+      <w:pPr>
+        <w:bidi w:val="1"/>
+        <w:jc w:val="right"/>
+      </w:pPr>
+    </w:p>
     <w:p>
       <w:pPr>
         <w:pStyle w:val="Heading1"/>
+        <w:bidi w:val="1"/>
+        <w:jc w:val="right"/>
       </w:pPr>
       <w:r>
         <w:rPr>
+          <w:rFonts w:cs="Arial"/>
           <w:color w:val="0D6B56"/>
         </w:rPr>
         <w:t>الواجب المنزلي</w:t>
       </w:r>
     </w:p>
     <w:p>
+      <w:pPr>
+        <w:bidi w:val="1"/>
+        <w:jc w:val="right"/>
+      </w:pPr>
       <w:r>
+        <w:rPr>
+          <w:rFonts w:cs="Arial"/>
+        </w:rPr>
         <w:t>{homework}</w:t>
       </w:r>
     </w:p>
-    <w:p/>
+    <w:p>
+      <w:pPr>
+        <w:bidi w:val="1"/>
+        <w:jc w:val="right"/>
+      </w:pPr>
+    </w:p>
     <w:p>
       <w:pPr>
         <w:pStyle w:val="Heading1"/>
+        <w:bidi w:val="1"/>
+        <w:jc w:val="right"/>
       </w:pPr>
       <w:r>
         <w:rPr>
+          <w:rFonts w:cs="Arial"/>
           <w:color w:val="0D6B56"/>
         </w:rPr>
         <w:t>الربط بالحياة</w:t>
       </w:r>
     </w:p>
     <w:p>
+      <w:pPr>
+        <w:bidi w:val="1"/>
+        <w:jc w:val="right"/>
+      </w:pPr>
       <w:r>
+        <w:rPr>
+          <w:rFonts w:cs="Arial"/>
+        </w:rPr>
         <w:t>{real_life_connection}</w:t>
       </w:r>
     </w:p>
-    <w:p/>
-    <w:p/>
+    <w:p>
+      <w:pPr>
+        <w:bidi w:val="1"/>
+        <w:jc w:val="right"/>
+      </w:pPr>
+    </w:p>
+    <w:p>
+      <w:pPr>
+        <w:bidi w:val="1"/>
+        <w:jc w:val="right"/>
+      </w:pPr>
+    </w:p>
     <w:tbl>
       <w:tblPr>
         <w:tblStyle w:val="TableGrid"/>
         <w:tblW w:type="auto" w:w="0"/>
         <w:tblLook w:firstColumn="1" w:firstRow="1" w:lastColumn="0" w:lastRow="0" w:noHBand="0" w:noVBand="1" w:val="04A0"/>
+        <w:bidiVisual/>
       </w:tblPr>
       <w:tblGrid>
         <w:gridCol w:w="3135"/>
@@ -769,9 +1420,18 @@
             <w:tcW w:type="dxa" w:w="3135"/>
           </w:tcPr>
           <w:p>
-            <w:r/>
+            <w:pPr>
+              <w:bidi w:val="1"/>
+              <w:jc w:val="right"/>
+            </w:pPr>
             <w:r>
               <w:rPr>
+                <w:rFonts w:cs="Arial"/>
+              </w:rPr>
+            </w:r>
+            <w:r>
+              <w:rPr>
+                <w:rFonts w:cs="Arial"/>
                 <w:b/>
                 <w:sz w:val="22"/>
               </w:rPr>
@@ -784,9 +1444,18 @@
             <w:tcW w:type="dxa" w:w="3135"/>
           </w:tcPr>
           <w:p>
-            <w:r/>
+            <w:pPr>
+              <w:bidi w:val="1"/>
+              <w:jc w:val="right"/>
+            </w:pPr>
             <w:r>
               <w:rPr>
+                <w:rFonts w:cs="Arial"/>
+              </w:rPr>
+            </w:r>
+            <w:r>
+              <w:rPr>
+                <w:rFonts w:cs="Arial"/>
                 <w:b/>
                 <w:sz w:val="22"/>
               </w:rPr>
@@ -799,9 +1468,18 @@
             <w:tcW w:type="dxa" w:w="3135"/>
           </w:tcPr>
           <w:p>
-            <w:r/>
+            <w:pPr>
+              <w:bidi w:val="1"/>
+              <w:jc w:val="right"/>
+            </w:pPr>
             <w:r>
               <w:rPr>
+                <w:rFonts w:cs="Arial"/>
+              </w:rPr>
+            </w:r>
+            <w:r>
+              <w:rPr>
+                <w:rFonts w:cs="Arial"/>
                 <w:b/>
                 <w:sz w:val="22"/>
               </w:rPr>
@@ -816,7 +1494,14 @@
             <w:tcW w:type="dxa" w:w="3135"/>
           </w:tcPr>
           <w:p>
+            <w:pPr>
+              <w:bidi w:val="1"/>
+              <w:jc w:val="right"/>
+            </w:pPr>
             <w:r>
+              <w:rPr>
+                <w:rFonts w:cs="Arial"/>
+              </w:rPr>
               <w:t xml:space="preserve"> </w:t>
             </w:r>
           </w:p>
@@ -826,7 +1511,14 @@
             <w:tcW w:type="dxa" w:w="3135"/>
           </w:tcPr>
           <w:p>
+            <w:pPr>
+              <w:bidi w:val="1"/>
+              <w:jc w:val="right"/>
+            </w:pPr>
             <w:r>
+              <w:rPr>
+                <w:rFonts w:cs="Arial"/>
+              </w:rPr>
               <w:t xml:space="preserve"> </w:t>
             </w:r>
           </w:p>
@@ -836,7 +1528,14 @@
             <w:tcW w:type="dxa" w:w="3135"/>
           </w:tcPr>
           <w:p>
+            <w:pPr>
+              <w:bidi w:val="1"/>
+              <w:jc w:val="right"/>
+            </w:pPr>
             <w:r>
+              <w:rPr>
+                <w:rFonts w:cs="Arial"/>
+              </w:rPr>
               <w:t xml:space="preserve"> </w:t>
             </w:r>
           </w:p>

</xml_diff>

<commit_message>
Fix Arabic document alignment and record CI acceptance boundaries
</commit_message>
<xml_diff>
--- a/server/templates/plan_template_qa.docx
+++ b/server/templates/plan_template_qa.docx
@@ -20,14 +20,14 @@
     <w:p>
       <w:pPr>
         <w:bidi w:val="1"/>
-        <w:jc w:val="right"/>
+        <w:jc w:val="start"/>
       </w:pPr>
     </w:p>
     <w:p>
       <w:pPr>
         <w:pStyle w:val="Heading1"/>
         <w:bidi w:val="1"/>
-        <w:jc w:val="right"/>
+        <w:jc w:val="start"/>
       </w:pPr>
       <w:r>
         <w:rPr>
@@ -59,7 +59,7 @@
           <w:p>
             <w:pPr>
               <w:bidi w:val="1"/>
-              <w:jc w:val="right"/>
+              <w:jc w:val="start"/>
             </w:pPr>
             <w:r>
               <w:rPr>
@@ -84,7 +84,7 @@
           <w:p>
             <w:pPr>
               <w:bidi w:val="1"/>
-              <w:jc w:val="right"/>
+              <w:jc w:val="start"/>
             </w:pPr>
             <w:r>
               <w:rPr>
@@ -107,7 +107,7 @@
           <w:p>
             <w:pPr>
               <w:bidi w:val="1"/>
-              <w:jc w:val="right"/>
+              <w:jc w:val="start"/>
             </w:pPr>
             <w:r>
               <w:rPr>
@@ -132,7 +132,7 @@
           <w:p>
             <w:pPr>
               <w:bidi w:val="1"/>
-              <w:jc w:val="right"/>
+              <w:jc w:val="start"/>
             </w:pPr>
             <w:r>
               <w:rPr>
@@ -157,7 +157,7 @@
           <w:p>
             <w:pPr>
               <w:bidi w:val="1"/>
-              <w:jc w:val="right"/>
+              <w:jc w:val="start"/>
             </w:pPr>
             <w:r>
               <w:rPr>
@@ -182,7 +182,7 @@
           <w:p>
             <w:pPr>
               <w:bidi w:val="1"/>
-              <w:jc w:val="right"/>
+              <w:jc w:val="start"/>
             </w:pPr>
             <w:r>
               <w:rPr>
@@ -205,7 +205,7 @@
           <w:p>
             <w:pPr>
               <w:bidi w:val="1"/>
-              <w:jc w:val="right"/>
+              <w:jc w:val="start"/>
             </w:pPr>
             <w:r>
               <w:rPr>
@@ -230,7 +230,7 @@
           <w:p>
             <w:pPr>
               <w:bidi w:val="1"/>
-              <w:jc w:val="right"/>
+              <w:jc w:val="start"/>
             </w:pPr>
             <w:r>
               <w:rPr>
@@ -255,7 +255,7 @@
           <w:p>
             <w:pPr>
               <w:bidi w:val="1"/>
-              <w:jc w:val="right"/>
+              <w:jc w:val="start"/>
             </w:pPr>
             <w:r>
               <w:rPr>
@@ -280,7 +280,7 @@
           <w:p>
             <w:pPr>
               <w:bidi w:val="1"/>
-              <w:jc w:val="right"/>
+              <w:jc w:val="start"/>
             </w:pPr>
             <w:r>
               <w:rPr>
@@ -303,7 +303,7 @@
           <w:p>
             <w:pPr>
               <w:bidi w:val="1"/>
-              <w:jc w:val="right"/>
+              <w:jc w:val="start"/>
             </w:pPr>
             <w:r>
               <w:rPr>
@@ -328,7 +328,7 @@
           <w:p>
             <w:pPr>
               <w:bidi w:val="1"/>
-              <w:jc w:val="right"/>
+              <w:jc w:val="start"/>
             </w:pPr>
             <w:r>
               <w:rPr>
@@ -353,7 +353,7 @@
           <w:p>
             <w:pPr>
               <w:bidi w:val="1"/>
-              <w:jc w:val="right"/>
+              <w:jc w:val="start"/>
             </w:pPr>
             <w:r>
               <w:rPr>
@@ -378,7 +378,7 @@
           <w:p>
             <w:pPr>
               <w:bidi w:val="1"/>
-              <w:jc w:val="right"/>
+              <w:jc w:val="start"/>
             </w:pPr>
             <w:r>
               <w:rPr>
@@ -401,7 +401,7 @@
           <w:p>
             <w:pPr>
               <w:bidi w:val="1"/>
-              <w:jc w:val="right"/>
+              <w:jc w:val="start"/>
             </w:pPr>
             <w:r>
               <w:rPr>
@@ -425,7 +425,7 @@
           <w:p>
             <w:pPr>
               <w:bidi w:val="1"/>
-              <w:jc w:val="right"/>
+              <w:jc w:val="start"/>
             </w:pPr>
             <w:r>
               <w:rPr>
@@ -445,14 +445,14 @@
     <w:p>
       <w:pPr>
         <w:bidi w:val="1"/>
-        <w:jc w:val="right"/>
+        <w:jc w:val="start"/>
       </w:pPr>
     </w:p>
     <w:p>
       <w:pPr>
         <w:pStyle w:val="Heading1"/>
         <w:bidi w:val="1"/>
-        <w:jc w:val="right"/>
+        <w:jc w:val="start"/>
       </w:pPr>
       <w:r>
         <w:rPr>
@@ -466,7 +466,7 @@
       <w:pPr>
         <w:pStyle w:val="ListBullet"/>
         <w:bidi w:val="1"/>
-        <w:jc w:val="right"/>
+        <w:jc w:val="start"/>
       </w:pPr>
       <w:r>
         <w:rPr>
@@ -478,7 +478,7 @@
     <w:p>
       <w:pPr>
         <w:bidi w:val="1"/>
-        <w:jc w:val="right"/>
+        <w:jc w:val="start"/>
       </w:pPr>
       <w:r>
         <w:rPr>
@@ -491,7 +491,7 @@
       <w:pPr>
         <w:pStyle w:val="ListBullet2"/>
         <w:bidi w:val="1"/>
-        <w:jc w:val="right"/>
+        <w:jc w:val="start"/>
       </w:pPr>
       <w:r>
         <w:rPr>
@@ -503,7 +503,7 @@
     <w:p>
       <w:pPr>
         <w:bidi w:val="1"/>
-        <w:jc w:val="right"/>
+        <w:jc w:val="start"/>
       </w:pPr>
       <w:r>
         <w:rPr>
@@ -516,7 +516,7 @@
       <w:pPr>
         <w:pStyle w:val="ListBullet"/>
         <w:bidi w:val="1"/>
-        <w:jc w:val="right"/>
+        <w:jc w:val="start"/>
       </w:pPr>
       <w:r>
         <w:rPr>
@@ -528,7 +528,7 @@
     <w:p>
       <w:pPr>
         <w:bidi w:val="1"/>
-        <w:jc w:val="right"/>
+        <w:jc w:val="start"/>
       </w:pPr>
       <w:r>
         <w:rPr>
@@ -541,7 +541,7 @@
       <w:pPr>
         <w:pStyle w:val="ListBullet2"/>
         <w:bidi w:val="1"/>
-        <w:jc w:val="right"/>
+        <w:jc w:val="start"/>
       </w:pPr>
       <w:r>
         <w:rPr>
@@ -553,7 +553,7 @@
     <w:p>
       <w:pPr>
         <w:bidi w:val="1"/>
-        <w:jc w:val="right"/>
+        <w:jc w:val="start"/>
       </w:pPr>
       <w:r>
         <w:rPr>
@@ -566,7 +566,7 @@
       <w:pPr>
         <w:pStyle w:val="ListBullet"/>
         <w:bidi w:val="1"/>
-        <w:jc w:val="right"/>
+        <w:jc w:val="start"/>
       </w:pPr>
       <w:r>
         <w:rPr>
@@ -578,7 +578,7 @@
     <w:p>
       <w:pPr>
         <w:bidi w:val="1"/>
-        <w:jc w:val="right"/>
+        <w:jc w:val="start"/>
       </w:pPr>
       <w:r>
         <w:rPr>
@@ -591,7 +591,7 @@
       <w:pPr>
         <w:pStyle w:val="ListBullet2"/>
         <w:bidi w:val="1"/>
-        <w:jc w:val="right"/>
+        <w:jc w:val="start"/>
       </w:pPr>
       <w:r>
         <w:rPr>
@@ -603,7 +603,7 @@
     <w:p>
       <w:pPr>
         <w:bidi w:val="1"/>
-        <w:jc w:val="right"/>
+        <w:jc w:val="start"/>
       </w:pPr>
       <w:r>
         <w:rPr>
@@ -615,14 +615,14 @@
     <w:p>
       <w:pPr>
         <w:bidi w:val="1"/>
-        <w:jc w:val="right"/>
+        <w:jc w:val="start"/>
       </w:pPr>
     </w:p>
     <w:p>
       <w:pPr>
         <w:pStyle w:val="Heading1"/>
         <w:bidi w:val="1"/>
-        <w:jc w:val="right"/>
+        <w:jc w:val="start"/>
       </w:pPr>
       <w:r>
         <w:rPr>
@@ -635,7 +635,7 @@
     <w:p>
       <w:pPr>
         <w:bidi w:val="1"/>
-        <w:jc w:val="right"/>
+        <w:jc w:val="start"/>
       </w:pPr>
       <w:r>
         <w:rPr>
@@ -647,14 +647,14 @@
     <w:p>
       <w:pPr>
         <w:bidi w:val="1"/>
-        <w:jc w:val="right"/>
+        <w:jc w:val="start"/>
       </w:pPr>
     </w:p>
     <w:p>
       <w:pPr>
         <w:pStyle w:val="Heading1"/>
         <w:bidi w:val="1"/>
-        <w:jc w:val="right"/>
+        <w:jc w:val="start"/>
       </w:pPr>
       <w:r>
         <w:rPr>
@@ -668,7 +668,7 @@
       <w:pPr>
         <w:pStyle w:val="ListBullet"/>
         <w:bidi w:val="1"/>
-        <w:jc w:val="right"/>
+        <w:jc w:val="start"/>
       </w:pPr>
       <w:r>
         <w:rPr>
@@ -680,7 +680,7 @@
     <w:p>
       <w:pPr>
         <w:bidi w:val="1"/>
-        <w:jc w:val="right"/>
+        <w:jc w:val="start"/>
       </w:pPr>
       <w:r>
         <w:rPr>
@@ -693,7 +693,7 @@
       <w:pPr>
         <w:pStyle w:val="ListBullet2"/>
         <w:bidi w:val="1"/>
-        <w:jc w:val="right"/>
+        <w:jc w:val="start"/>
       </w:pPr>
       <w:r>
         <w:rPr>
@@ -705,7 +705,7 @@
     <w:p>
       <w:pPr>
         <w:bidi w:val="1"/>
-        <w:jc w:val="right"/>
+        <w:jc w:val="start"/>
       </w:pPr>
       <w:r>
         <w:rPr>
@@ -718,7 +718,7 @@
       <w:pPr>
         <w:pStyle w:val="ListBullet"/>
         <w:bidi w:val="1"/>
-        <w:jc w:val="right"/>
+        <w:jc w:val="start"/>
       </w:pPr>
       <w:r>
         <w:rPr>
@@ -730,7 +730,7 @@
     <w:p>
       <w:pPr>
         <w:bidi w:val="1"/>
-        <w:jc w:val="right"/>
+        <w:jc w:val="start"/>
       </w:pPr>
       <w:r>
         <w:rPr>
@@ -743,7 +743,7 @@
       <w:pPr>
         <w:pStyle w:val="ListBullet2"/>
         <w:bidi w:val="1"/>
-        <w:jc w:val="right"/>
+        <w:jc w:val="start"/>
       </w:pPr>
       <w:r>
         <w:rPr>
@@ -755,7 +755,7 @@
     <w:p>
       <w:pPr>
         <w:bidi w:val="1"/>
-        <w:jc w:val="right"/>
+        <w:jc w:val="start"/>
       </w:pPr>
       <w:r>
         <w:rPr>
@@ -767,14 +767,14 @@
     <w:p>
       <w:pPr>
         <w:bidi w:val="1"/>
-        <w:jc w:val="right"/>
+        <w:jc w:val="start"/>
       </w:pPr>
     </w:p>
     <w:p>
       <w:pPr>
         <w:pStyle w:val="Heading1"/>
         <w:bidi w:val="1"/>
-        <w:jc w:val="right"/>
+        <w:jc w:val="start"/>
       </w:pPr>
       <w:r>
         <w:rPr>
@@ -806,7 +806,7 @@
           <w:p>
             <w:pPr>
               <w:bidi w:val="1"/>
-              <w:jc w:val="right"/>
+              <w:jc w:val="start"/>
             </w:pPr>
             <w:r>
               <w:rPr>
@@ -831,7 +831,7 @@
           <w:p>
             <w:pPr>
               <w:bidi w:val="1"/>
-              <w:jc w:val="right"/>
+              <w:jc w:val="start"/>
             </w:pPr>
             <w:r>
               <w:rPr>
@@ -856,7 +856,7 @@
           <w:p>
             <w:pPr>
               <w:bidi w:val="1"/>
-              <w:jc w:val="right"/>
+              <w:jc w:val="start"/>
             </w:pPr>
             <w:r>
               <w:rPr>
@@ -881,7 +881,7 @@
           <w:p>
             <w:pPr>
               <w:bidi w:val="1"/>
-              <w:jc w:val="right"/>
+              <w:jc w:val="start"/>
             </w:pPr>
             <w:r>
               <w:rPr>
@@ -908,7 +908,7 @@
           <w:p>
             <w:pPr>
               <w:bidi w:val="1"/>
-              <w:jc w:val="right"/>
+              <w:jc w:val="start"/>
             </w:pPr>
             <w:r>
               <w:rPr>
@@ -925,7 +925,7 @@
           <w:p>
             <w:pPr>
               <w:bidi w:val="1"/>
-              <w:jc w:val="right"/>
+              <w:jc w:val="start"/>
             </w:pPr>
             <w:r>
               <w:rPr>
@@ -942,7 +942,7 @@
           <w:p>
             <w:pPr>
               <w:bidi w:val="1"/>
-              <w:jc w:val="right"/>
+              <w:jc w:val="start"/>
             </w:pPr>
             <w:r>
               <w:rPr>
@@ -959,7 +959,7 @@
           <w:p>
             <w:pPr>
               <w:bidi w:val="1"/>
-              <w:jc w:val="right"/>
+              <w:jc w:val="start"/>
             </w:pPr>
             <w:r>
               <w:rPr>
@@ -974,14 +974,14 @@
     <w:p>
       <w:pPr>
         <w:bidi w:val="1"/>
-        <w:jc w:val="right"/>
+        <w:jc w:val="start"/>
       </w:pPr>
     </w:p>
     <w:p>
       <w:pPr>
         <w:pStyle w:val="Heading1"/>
         <w:bidi w:val="1"/>
-        <w:jc w:val="right"/>
+        <w:jc w:val="start"/>
       </w:pPr>
       <w:r>
         <w:rPr>
@@ -995,7 +995,7 @@
       <w:pPr>
         <w:pStyle w:val="ListBullet"/>
         <w:bidi w:val="1"/>
-        <w:jc w:val="right"/>
+        <w:jc w:val="start"/>
       </w:pPr>
       <w:r>
         <w:rPr>
@@ -1007,7 +1007,7 @@
     <w:p>
       <w:pPr>
         <w:bidi w:val="1"/>
-        <w:jc w:val="right"/>
+        <w:jc w:val="start"/>
       </w:pPr>
       <w:r>
         <w:rPr>
@@ -1020,7 +1020,7 @@
       <w:pPr>
         <w:pStyle w:val="ListBullet"/>
         <w:bidi w:val="1"/>
-        <w:jc w:val="right"/>
+        <w:jc w:val="start"/>
       </w:pPr>
       <w:r>
         <w:rPr>
@@ -1032,7 +1032,7 @@
     <w:p>
       <w:pPr>
         <w:bidi w:val="1"/>
-        <w:jc w:val="right"/>
+        <w:jc w:val="start"/>
       </w:pPr>
       <w:r>
         <w:rPr>
@@ -1045,7 +1045,7 @@
       <w:pPr>
         <w:pStyle w:val="ListBullet2"/>
         <w:bidi w:val="1"/>
-        <w:jc w:val="right"/>
+        <w:jc w:val="start"/>
       </w:pPr>
       <w:r>
         <w:rPr>
@@ -1057,7 +1057,7 @@
     <w:p>
       <w:pPr>
         <w:bidi w:val="1"/>
-        <w:jc w:val="right"/>
+        <w:jc w:val="start"/>
       </w:pPr>
       <w:r>
         <w:rPr>
@@ -1070,7 +1070,7 @@
       <w:pPr>
         <w:pStyle w:val="ListBullet"/>
         <w:bidi w:val="1"/>
-        <w:jc w:val="right"/>
+        <w:jc w:val="start"/>
       </w:pPr>
       <w:r>
         <w:rPr>
@@ -1082,7 +1082,7 @@
     <w:p>
       <w:pPr>
         <w:bidi w:val="1"/>
-        <w:jc w:val="right"/>
+        <w:jc w:val="start"/>
       </w:pPr>
       <w:r>
         <w:rPr>
@@ -1095,7 +1095,7 @@
       <w:pPr>
         <w:pStyle w:val="ListBullet2"/>
         <w:bidi w:val="1"/>
-        <w:jc w:val="right"/>
+        <w:jc w:val="start"/>
       </w:pPr>
       <w:r>
         <w:rPr>
@@ -1107,7 +1107,7 @@
     <w:p>
       <w:pPr>
         <w:bidi w:val="1"/>
-        <w:jc w:val="right"/>
+        <w:jc w:val="start"/>
       </w:pPr>
       <w:r>
         <w:rPr>
@@ -1119,14 +1119,14 @@
     <w:p>
       <w:pPr>
         <w:bidi w:val="1"/>
-        <w:jc w:val="right"/>
+        <w:jc w:val="start"/>
       </w:pPr>
     </w:p>
     <w:p>
       <w:pPr>
         <w:pStyle w:val="Heading1"/>
         <w:bidi w:val="1"/>
-        <w:jc w:val="right"/>
+        <w:jc w:val="start"/>
       </w:pPr>
       <w:r>
         <w:rPr>
@@ -1139,7 +1139,7 @@
     <w:p>
       <w:pPr>
         <w:bidi w:val="1"/>
-        <w:jc w:val="right"/>
+        <w:jc w:val="start"/>
       </w:pPr>
       <w:r>
         <w:rPr>
@@ -1152,7 +1152,7 @@
       <w:pPr>
         <w:pStyle w:val="ListBullet"/>
         <w:bidi w:val="1"/>
-        <w:jc w:val="right"/>
+        <w:jc w:val="start"/>
       </w:pPr>
       <w:r>
         <w:rPr>
@@ -1164,7 +1164,7 @@
     <w:p>
       <w:pPr>
         <w:bidi w:val="1"/>
-        <w:jc w:val="right"/>
+        <w:jc w:val="start"/>
       </w:pPr>
       <w:r>
         <w:rPr>
@@ -1176,14 +1176,14 @@
     <w:p>
       <w:pPr>
         <w:bidi w:val="1"/>
-        <w:jc w:val="right"/>
+        <w:jc w:val="start"/>
       </w:pPr>
     </w:p>
     <w:p>
       <w:pPr>
         <w:pStyle w:val="Heading1"/>
         <w:bidi w:val="1"/>
-        <w:jc w:val="right"/>
+        <w:jc w:val="start"/>
       </w:pPr>
       <w:r>
         <w:rPr>
@@ -1196,7 +1196,7 @@
     <w:p>
       <w:pPr>
         <w:bidi w:val="1"/>
-        <w:jc w:val="right"/>
+        <w:jc w:val="start"/>
       </w:pPr>
       <w:r>
         <w:rPr>
@@ -1208,14 +1208,14 @@
     <w:p>
       <w:pPr>
         <w:bidi w:val="1"/>
-        <w:jc w:val="right"/>
+        <w:jc w:val="start"/>
       </w:pPr>
     </w:p>
     <w:p>
       <w:pPr>
         <w:pStyle w:val="Heading1"/>
         <w:bidi w:val="1"/>
-        <w:jc w:val="right"/>
+        <w:jc w:val="start"/>
       </w:pPr>
       <w:r>
         <w:rPr>
@@ -1245,7 +1245,7 @@
           <w:p>
             <w:pPr>
               <w:bidi w:val="1"/>
-              <w:jc w:val="right"/>
+              <w:jc w:val="start"/>
             </w:pPr>
             <w:r>
               <w:rPr>
@@ -1270,7 +1270,7 @@
           <w:p>
             <w:pPr>
               <w:bidi w:val="1"/>
-              <w:jc w:val="right"/>
+              <w:jc w:val="start"/>
             </w:pPr>
             <w:r>
               <w:rPr>
@@ -1297,7 +1297,7 @@
           <w:p>
             <w:pPr>
               <w:bidi w:val="1"/>
-              <w:jc w:val="right"/>
+              <w:jc w:val="start"/>
             </w:pPr>
             <w:r>
               <w:rPr>
@@ -1314,7 +1314,7 @@
           <w:p>
             <w:pPr>
               <w:bidi w:val="1"/>
-              <w:jc w:val="right"/>
+              <w:jc w:val="start"/>
             </w:pPr>
             <w:r>
               <w:rPr>
@@ -1329,14 +1329,14 @@
     <w:p>
       <w:pPr>
         <w:bidi w:val="1"/>
-        <w:jc w:val="right"/>
+        <w:jc w:val="start"/>
       </w:pPr>
     </w:p>
     <w:p>
       <w:pPr>
         <w:pStyle w:val="Heading1"/>
         <w:bidi w:val="1"/>
-        <w:jc w:val="right"/>
+        <w:jc w:val="start"/>
       </w:pPr>
       <w:r>
         <w:rPr>
@@ -1349,7 +1349,7 @@
     <w:p>
       <w:pPr>
         <w:bidi w:val="1"/>
-        <w:jc w:val="right"/>
+        <w:jc w:val="start"/>
       </w:pPr>
       <w:r>
         <w:rPr>
@@ -1361,14 +1361,14 @@
     <w:p>
       <w:pPr>
         <w:bidi w:val="1"/>
-        <w:jc w:val="right"/>
+        <w:jc w:val="start"/>
       </w:pPr>
     </w:p>
     <w:p>
       <w:pPr>
         <w:pStyle w:val="Heading1"/>
         <w:bidi w:val="1"/>
-        <w:jc w:val="right"/>
+        <w:jc w:val="start"/>
       </w:pPr>
       <w:r>
         <w:rPr>
@@ -1381,7 +1381,7 @@
     <w:p>
       <w:pPr>
         <w:bidi w:val="1"/>
-        <w:jc w:val="right"/>
+        <w:jc w:val="start"/>
       </w:pPr>
       <w:r>
         <w:rPr>
@@ -1393,13 +1393,13 @@
     <w:p>
       <w:pPr>
         <w:bidi w:val="1"/>
-        <w:jc w:val="right"/>
+        <w:jc w:val="start"/>
       </w:pPr>
     </w:p>
     <w:p>
       <w:pPr>
         <w:bidi w:val="1"/>
-        <w:jc w:val="right"/>
+        <w:jc w:val="start"/>
       </w:pPr>
     </w:p>
     <w:tbl>
@@ -1422,7 +1422,7 @@
           <w:p>
             <w:pPr>
               <w:bidi w:val="1"/>
-              <w:jc w:val="right"/>
+              <w:jc w:val="start"/>
             </w:pPr>
             <w:r>
               <w:rPr>
@@ -1446,7 +1446,7 @@
           <w:p>
             <w:pPr>
               <w:bidi w:val="1"/>
-              <w:jc w:val="right"/>
+              <w:jc w:val="start"/>
             </w:pPr>
             <w:r>
               <w:rPr>
@@ -1470,7 +1470,7 @@
           <w:p>
             <w:pPr>
               <w:bidi w:val="1"/>
-              <w:jc w:val="right"/>
+              <w:jc w:val="start"/>
             </w:pPr>
             <w:r>
               <w:rPr>
@@ -1496,7 +1496,7 @@
           <w:p>
             <w:pPr>
               <w:bidi w:val="1"/>
-              <w:jc w:val="right"/>
+              <w:jc w:val="start"/>
             </w:pPr>
             <w:r>
               <w:rPr>
@@ -1513,7 +1513,7 @@
           <w:p>
             <w:pPr>
               <w:bidi w:val="1"/>
-              <w:jc w:val="right"/>
+              <w:jc w:val="start"/>
             </w:pPr>
             <w:r>
               <w:rPr>
@@ -1530,7 +1530,7 @@
           <w:p>
             <w:pPr>
               <w:bidi w:val="1"/>
-              <w:jc w:val="right"/>
+              <w:jc w:val="start"/>
             </w:pPr>
             <w:r>
               <w:rPr>

</xml_diff>